<commit_message>
docs : calibrate all docs
</commit_message>
<xml_diff>
--- a/docs/02_软件系统的需求构思及描述.docx
+++ b/docs/02_软件系统的需求构思及描述.docx
@@ -1479,27 +1479,71 @@
           <w:rFonts w:ascii="宋体" w:hAnsi="宋体"/>
           <w:szCs w:val="24"/>
         </w:rPr>
-        <w:t>核心创意：将系统设计为“旅客旅程伴随式</w:t>
+        <w:t>核心创意：将系统设计为“旅客旅程伴随式 Agent”，核心输出不是聊天文本，而是 GUI 中持续更新的状态、时间轴、倒计时和行动卡片。Agent 的职责是把多源状态转化为旅客可以执行的任务序列。</w:t>
       </w:r>
       <w:r>
         <w:rPr>
           <w:rFonts w:cs="Times New Roman"/>
           <w:szCs w:val="24"/>
         </w:rPr>
-        <w:t xml:space="preserve"> Agent</w:t>
-      </w:r>
-      <w:r>
-        <w:rPr>
-          <w:rFonts w:ascii="宋体" w:hAnsi="宋体"/>
-          <w:szCs w:val="24"/>
-        </w:rPr>
-        <w:t>”，核心输出不是聊天文本，而是 GUI 中持续更新的状态、时间轴、地图、倒计时和行动卡片。</w:t>
+      </w:r>
+      <w:r>
+        <w:rPr>
+          <w:rFonts w:ascii="宋体" w:hAnsi="宋体"/>
+          <w:szCs w:val="24"/>
+        </w:rPr>
       </w:r>
       <w:r>
         <w:rPr>
           <w:rFonts w:cs="Times New Roman"/>
           <w:szCs w:val="24"/>
         </w:rPr>
+      </w:r>
+      <w:r>
+        <w:rPr>
+          <w:rFonts w:ascii="宋体" w:hAnsi="宋体"/>
+          <w:szCs w:val="24"/>
+        </w:rPr>
+      </w:r>
+    </w:p>
+    <w:p>
+      <w:pPr>
+        <w:spacing w:after="120"/>
+        <w:ind w:firstLineChars="200" w:firstLine="480"/>
+        <w:rPr>
+          <w:rFonts w:ascii="宋体" w:hAnsi="宋体" w:hint="eastAsia"/>
+          <w:szCs w:val="24"/>
+        </w:rPr>
+      </w:pPr>
+      <w:r>
+        <w:rPr>
+          <w:rFonts w:ascii="宋体" w:hAnsi="宋体"/>
+          <w:szCs w:val="24"/>
+        </w:rPr>
+        <w:t>创意一：多航班旅程建模。旅客可一次输入多个航班，系统自动建立航段顺序、中转关系、关键时间节点和完成条件；任一航段变化时，重新评估后续航段的可达性。</w:t>
+      </w:r>
+    </w:p>
+    <w:p>
+      <w:pPr>
+        <w:spacing w:after="120"/>
+        <w:ind w:firstLineChars="200" w:firstLine="480"/>
+        <w:rPr>
+          <w:rFonts w:ascii="宋体" w:hAnsi="宋体" w:hint="eastAsia"/>
+          <w:szCs w:val="24"/>
+        </w:rPr>
+      </w:pPr>
+      <w:r>
+        <w:rPr>
+          <w:rFonts w:ascii="宋体" w:hAnsi="宋体"/>
+          <w:szCs w:val="24"/>
+        </w:rPr>
+        <w:t>创意二：三态融合。</w:t>
+      </w:r>
+      <w:r>
+        <w:rPr>
+          <w:rFonts w:cs="Times New Roman"/>
+          <w:szCs w:val="24"/>
+        </w:rPr>
         <w:t>Agent</w:t>
       </w:r>
       <w:r>
@@ -1507,7 +1551,7 @@
           <w:rFonts w:ascii="宋体" w:hAnsi="宋体"/>
           <w:szCs w:val="24"/>
         </w:rPr>
-        <w:t xml:space="preserve"> 的职责是把多源状态转化为旅客可以执行的任务序列。</w:t>
+        <w:t xml:space="preserve"> 同时接收航班状态、机场状态和旅客状态。航班状态包括计划、延误、取消、登机口和登机时限；机场状态包括排队、通道、节点距离和资源开放情况；旅客状态包括当前位置、时间、行程进度、交通方式、行李和经授权的特殊需求。</w:t>
       </w:r>
     </w:p>
     <w:p>
@@ -1524,7 +1568,21 @@
           <w:rFonts w:ascii="宋体" w:hAnsi="宋体"/>
           <w:szCs w:val="24"/>
         </w:rPr>
-        <w:t>创意一：多航班旅程建模。旅客可一次输入多个航班，系统自动建立航段顺序、中转关系、关键时间节点和完成条件；任一航段变化时，重新评估后续航段的可达性。</w:t>
+        <w:t>创意三：面向行动的动态重规划。系统不是只显示“延误</w:t>
+      </w:r>
+      <w:r>
+        <w:rPr>
+          <w:rFonts w:cs="Times New Roman"/>
+          <w:szCs w:val="24"/>
+        </w:rPr>
+        <w:t>45</w:t>
+      </w:r>
+      <w:r>
+        <w:rPr>
+          <w:rFonts w:ascii="宋体" w:hAnsi="宋体"/>
+          <w:szCs w:val="24"/>
+        </w:rPr>
+        <w:t>分钟”，而是计算旅客是否仍有足够缓冲，并在候选方案中给出继续前往、改走机场内部路径、提前前往服务柜台、联系航司或关注后续航段等行动。</w:t>
       </w:r>
     </w:p>
     <w:p>
@@ -1541,21 +1599,19 @@
           <w:rFonts w:ascii="宋体" w:hAnsi="宋体"/>
           <w:szCs w:val="24"/>
         </w:rPr>
-        <w:t>创意二：三态融合。</w:t>
+        <w:t>创意四：GUI 优先。客户端用旅程时间轴呈现当前阶段，用状态区、倒计时和红黄绿标识表达剩余时间与风险，用行动卡片展示下一步；城市导航通过跳转成熟的地图导航应用完成，机场内部以各节点的文字步行指引说明路线，客户端不内嵌地图引擎；文字只作为辅助解释，避免旅客在移动中阅读长篇回答。</w:t>
       </w:r>
       <w:r>
         <w:rPr>
           <w:rFonts w:cs="Times New Roman"/>
           <w:szCs w:val="24"/>
         </w:rPr>
-        <w:t>Agent</w:t>
-      </w:r>
-      <w:r>
-        <w:rPr>
-          <w:rFonts w:ascii="宋体" w:hAnsi="宋体"/>
-          <w:szCs w:val="24"/>
-        </w:rPr>
-        <w:t xml:space="preserve"> 同时接收航班状态、机场状态和旅客状态。航班状态包括计划、延误、取消、登机口和登机时限；机场状态包括排队、通道、节点距离和资源开放情况；旅客状态包括当前位置、时间、行程进度、交通方式、行李和经授权的特殊需求。</w:t>
+      </w:r>
+      <w:r>
+        <w:rPr>
+          <w:rFonts w:ascii="宋体" w:hAnsi="宋体"/>
+          <w:szCs w:val="24"/>
+        </w:rPr>
       </w:r>
     </w:p>
     <w:p>
@@ -1572,21 +1628,7 @@
           <w:rFonts w:ascii="宋体" w:hAnsi="宋体"/>
           <w:szCs w:val="24"/>
         </w:rPr>
-        <w:t>创意三：面向行动的动态重规划。系统不是只显示“延误</w:t>
-      </w:r>
-      <w:r>
-        <w:rPr>
-          <w:rFonts w:cs="Times New Roman"/>
-          <w:szCs w:val="24"/>
-        </w:rPr>
-        <w:t>45</w:t>
-      </w:r>
-      <w:r>
-        <w:rPr>
-          <w:rFonts w:ascii="宋体" w:hAnsi="宋体"/>
-          <w:szCs w:val="24"/>
-        </w:rPr>
-        <w:t>分钟”，而是计算旅客是否仍有足够缓冲，并在候选方案中给出继续前往、改走机场内部路径、提前前往服务柜台、联系航司或关注后续航段等行动。</w:t>
+        <w:t>创意五：可解释与可回退。每条建议显示数据更新时间、触发原因和置信等级；当定位、航班接口或机场数据不可用时，系统切换到最近一次可信状态、手动确认和人工服务入口。</w:t>
       </w:r>
     </w:p>
     <w:p>
@@ -1603,55 +1645,7 @@
           <w:rFonts w:ascii="宋体" w:hAnsi="宋体"/>
           <w:szCs w:val="24"/>
         </w:rPr>
-        <w:t>创意四：</w:t>
-      </w:r>
-      <w:r>
-        <w:rPr>
-          <w:rFonts w:cs="Times New Roman"/>
-          <w:szCs w:val="24"/>
-        </w:rPr>
-        <w:t>GUI</w:t>
-      </w:r>
-      <w:r>
-        <w:rPr>
-          <w:rFonts w:ascii="宋体" w:hAnsi="宋体"/>
-          <w:szCs w:val="24"/>
-        </w:rPr>
-        <w:t xml:space="preserve"> 优先。客户端用旅程时间轴呈现当前阶段，用机场平面或城市地图呈现路线，用红黄绿状态表达风险，用行动卡片展示下一步和完成按钮；文字只作为辅助解释，避免旅客在移动中阅读长篇回答。</w:t>
-      </w:r>
-    </w:p>
-    <w:p>
-      <w:pPr>
-        <w:spacing w:after="120"/>
-        <w:ind w:firstLineChars="200" w:firstLine="480"/>
-        <w:rPr>
-          <w:rFonts w:ascii="宋体" w:hAnsi="宋体" w:hint="eastAsia"/>
-          <w:szCs w:val="24"/>
-        </w:rPr>
-      </w:pPr>
-      <w:r>
-        <w:rPr>
-          <w:rFonts w:ascii="宋体" w:hAnsi="宋体"/>
-          <w:szCs w:val="24"/>
-        </w:rPr>
-        <w:t>创意五：可解释与可回退。每条建议显示数据更新时间、触发原因和置信等级；当定位、航班接口或机场数据不可用时，系统切换到最近一次可信状态、手动确认和人工服务入口。</w:t>
-      </w:r>
-    </w:p>
-    <w:p>
-      <w:pPr>
-        <w:spacing w:after="120"/>
-        <w:ind w:firstLineChars="200" w:firstLine="480"/>
-        <w:rPr>
-          <w:rFonts w:ascii="宋体" w:hAnsi="宋体" w:hint="eastAsia"/>
-          <w:szCs w:val="24"/>
-        </w:rPr>
-      </w:pPr>
-      <w:r>
-        <w:rPr>
-          <w:rFonts w:ascii="宋体" w:hAnsi="宋体"/>
-          <w:szCs w:val="24"/>
-        </w:rPr>
-        <w:t>协同设备、系统和服务：客户端定位与时钟、航班动态接口、机场运行与地图接口、城市交通服务、消息推送服务、身份与权限服务、云端数据库、预测模型服务和规则/优化引擎。</w:t>
+        <w:t>协同设备、系统和服务：客户端定位与时钟、航班动态接口、机场服务状态数据、城市交通与路径规划服务、地图导航应用（仅跳转）、消息推送服务、身份与权限服务、数据存储服务和大模型服务。</w:t>
       </w:r>
     </w:p>
     <w:p>
@@ -1735,66 +1729,59 @@
           <w:rFonts w:ascii="宋体" w:hAnsi="宋体" w:hint="eastAsia"/>
           <w:szCs w:val="24"/>
         </w:rPr>
-        <w:t xml:space="preserve">云端 </w:t>
+        <w:t>云端 Agent 服务端是系统的核心。服务端负责接收旅客输入的航班信息和当前位置，获取航班动态信息、机场运行信息、机场节点与路径信息，对这些数据进行统一处理。Agent 根据航班状态、机场状态、旅客当前位置和当前时间，判断旅客当前所处的出行阶段，分析旅客是否能够按时完成值机、安检、候机和登机等任务，并生成下一步行动建议。</w:t>
       </w:r>
       <w:r>
         <w:rPr>
           <w:rFonts w:cs="Times New Roman"/>
           <w:szCs w:val="24"/>
         </w:rPr>
-        <w:t>Agent</w:t>
-      </w:r>
-      <w:r>
-        <w:rPr>
-          <w:rFonts w:ascii="宋体" w:hAnsi="宋体" w:hint="eastAsia"/>
-          <w:szCs w:val="24"/>
-        </w:rPr>
-        <w:t xml:space="preserve"> 服务端是系统的核心。服务端负责接收旅客输入的航班信息和当前位置，获取航班动态信息、机场运行信息、机场地图及节点信息，对这些数据进行统一处理。</w:t>
+      </w:r>
+      <w:r>
+        <w:rPr>
+          <w:rFonts w:ascii="宋体" w:hAnsi="宋体" w:hint="eastAsia"/>
+          <w:szCs w:val="24"/>
+        </w:rPr>
       </w:r>
       <w:r>
         <w:rPr>
           <w:rFonts w:cs="Times New Roman"/>
           <w:szCs w:val="24"/>
         </w:rPr>
-        <w:t>Agent</w:t>
-      </w:r>
-      <w:r>
-        <w:rPr>
-          <w:rFonts w:ascii="宋体" w:hAnsi="宋体" w:hint="eastAsia"/>
-          <w:szCs w:val="24"/>
-        </w:rPr>
-        <w:t xml:space="preserve"> 根据航班状态、机场状态、旅客当前位置和当前时间，判断旅客当前所处的出行阶段，分析旅客是否能够按时完成值机、安检、候机和登机等任务，并生成下一步行动建议。</w:t>
-      </w:r>
-    </w:p>
-    <w:p>
-      <w:pPr>
-        <w:ind w:firstLineChars="200" w:firstLine="480"/>
-        <w:rPr>
-          <w:rFonts w:ascii="宋体" w:hAnsi="宋体" w:hint="eastAsia"/>
-          <w:szCs w:val="24"/>
-        </w:rPr>
-      </w:pPr>
-      <w:r>
-        <w:rPr>
-          <w:rFonts w:ascii="宋体" w:hAnsi="宋体" w:hint="eastAsia"/>
-          <w:szCs w:val="24"/>
-        </w:rPr>
-        <w:lastRenderedPageBreak/>
-        <w:t xml:space="preserve">外部数据源包括航班动态数据、机场服务状态数据、机场地图及路径数据、旅客定位数据和时间数据。航班动态数据用于获取航班计划、延误、取消、登机口和登机时间等信息；机场数据用于获取航站楼、值机柜台、安检区域、登机口和机场拥堵情况；定位数据用于确定旅客当前所在位置。云端 </w:t>
+      </w:r>
+      <w:r>
+        <w:rPr>
+          <w:rFonts w:ascii="宋体" w:hAnsi="宋体" w:hint="eastAsia"/>
+          <w:szCs w:val="24"/>
+        </w:rPr>
+      </w:r>
+    </w:p>
+    <w:p>
+      <w:pPr>
+        <w:ind w:firstLineChars="200" w:firstLine="480"/>
+        <w:rPr>
+          <w:rFonts w:ascii="宋体" w:hAnsi="宋体" w:hint="eastAsia"/>
+          <w:szCs w:val="24"/>
+        </w:rPr>
+      </w:pPr>
+      <w:r>
+        <w:rPr>
+          <w:rFonts w:ascii="宋体" w:hAnsi="宋体" w:hint="eastAsia"/>
+          <w:szCs w:val="24"/>
+        </w:rPr>
+        <w:t>外部数据源包括航班动态数据、机场服务状态数据、机场节点及路径数据、旅客定位数据和时间数据。航班动态数据用于获取航班计划、延误、取消、登机口和登机时间等信息；机场数据用于获取航站楼、值机柜台、安检区域、登机口和机场拥堵情况；定位数据用于确定旅客当前所在位置。云端 Agent 对外部数据进行融合后，将结构化结果返回客户端。</w:t>
       </w:r>
       <w:r>
         <w:rPr>
           <w:rFonts w:cs="Times New Roman"/>
           <w:szCs w:val="24"/>
         </w:rPr>
-        <w:t>Agent</w:t>
-      </w:r>
-      <w:r>
-        <w:rPr>
-          <w:rFonts w:ascii="宋体" w:hAnsi="宋体" w:hint="eastAsia"/>
-          <w:szCs w:val="24"/>
-        </w:rPr>
-        <w:t xml:space="preserve"> 对外部数据进行融合后，将结构化结果返回客户端。</w:t>
+      </w:r>
+      <w:r>
+        <w:rPr>
+          <w:rFonts w:ascii="宋体" w:hAnsi="宋体" w:hint="eastAsia"/>
+          <w:szCs w:val="24"/>
+        </w:rPr>
       </w:r>
     </w:p>
     <w:p>
@@ -1810,21 +1797,19 @@
           <w:rFonts w:ascii="宋体" w:hAnsi="宋体" w:hint="eastAsia"/>
           <w:szCs w:val="24"/>
         </w:rPr>
-        <w:t xml:space="preserve">系统的基本工作流程为：旅客在客户端输入航班信息，授权客户端获取当前位置；客户端将航班信息、当前位置和当前时间发送至云端；云端 </w:t>
+        <w:t>系统的基本工作流程为：旅客在客户端输入航班信息，授权客户端获取当前位置；客户端将航班信息、当前位置和当前时间发送至云端；云端 Agent 获取并处理航班与机场数据，完成状态判断和行动方案生成；客户端以状态区、时间轴、倒计时、状态标识和行动卡片等 GUI 形式展示结果，需要城市导航时跳转地图导航应用。</w:t>
       </w:r>
       <w:r>
         <w:rPr>
           <w:rFonts w:cs="Times New Roman"/>
           <w:szCs w:val="24"/>
         </w:rPr>
-        <w:t>Agent</w:t>
-      </w:r>
-      <w:r>
-        <w:rPr>
-          <w:rFonts w:ascii="宋体" w:hAnsi="宋体" w:hint="eastAsia"/>
-          <w:szCs w:val="24"/>
-        </w:rPr>
-        <w:t xml:space="preserve"> 获取并处理航班与机场数据，完成状态判断和行动方案生成；客户端以地图、时间轴、倒计时、状态标识和行动卡片等 GUI 形式展示结果。</w:t>
+      </w:r>
+      <w:r>
+        <w:rPr>
+          <w:rFonts w:ascii="宋体" w:hAnsi="宋体" w:hint="eastAsia"/>
+          <w:szCs w:val="24"/>
+        </w:rPr>
       </w:r>
     </w:p>
     <w:p>
@@ -1871,178 +1856,165 @@
           <w:rFonts w:ascii="宋体" w:hAnsi="宋体" w:hint="eastAsia"/>
           <w:sz w:val="23"/>
         </w:rPr>
-        <w:t>本系统根据五个软件创意设计五项核心功能。客户端主要负责航班输入、位置获</w:t>
-      </w:r>
-      <w:r>
-        <w:rPr>
-          <w:rFonts w:ascii="宋体" w:hAnsi="宋体" w:hint="eastAsia"/>
-          <w:szCs w:val="24"/>
-        </w:rPr>
-        <w:t xml:space="preserve">取和结果展示，航班信息、机场信息、旅客状态的融合处理，以及预测、推理和方案生成均由云端 </w:t>
+        <w:t>系统围绕“状态感知—行动决策—界面引导”提供五项核心功能。客户端主要负责航班输入、位置获取和结果展示；航班信息、机场信息、旅客状态的融合处理，以及旅客状态分析、风险判断和行动建议生成均由云端 Agent 服务端完成。</w:t>
+      </w:r>
+      <w:r>
+        <w:rPr>
+          <w:rFonts w:ascii="宋体" w:hAnsi="宋体" w:hint="eastAsia"/>
+          <w:szCs w:val="24"/>
+        </w:rPr>
       </w:r>
       <w:r>
         <w:rPr>
           <w:rFonts w:cs="Times New Roman"/>
           <w:szCs w:val="24"/>
         </w:rPr>
-        <w:t>Agent</w:t>
-      </w:r>
-      <w:r>
-        <w:rPr>
-          <w:rFonts w:ascii="宋体" w:hAnsi="宋体" w:hint="eastAsia"/>
-          <w:szCs w:val="24"/>
-        </w:rPr>
-        <w:t xml:space="preserve"> 服务端完成。</w:t>
-      </w:r>
-    </w:p>
-    <w:p>
-      <w:pPr>
-        <w:ind w:firstLineChars="200" w:firstLine="480"/>
-        <w:rPr>
-          <w:rFonts w:ascii="宋体" w:hAnsi="宋体" w:hint="eastAsia"/>
-          <w:szCs w:val="24"/>
-        </w:rPr>
-      </w:pPr>
-      <w:r>
-        <w:rPr>
-          <w:rFonts w:ascii="宋体" w:hAnsi="宋体" w:hint="eastAsia"/>
-          <w:szCs w:val="24"/>
-        </w:rPr>
-        <w:t xml:space="preserve">功能一：多航班旅程建模。旅客可以在客户端输入一个或多个航班，系统根据航班顺序建立完整的出行旅程，识别出发机场、到达机场、中转机场、预计起飞时间、登机时间和登机口等关键节点。当航班信息发生变化时，云端 </w:t>
+      </w:r>
+      <w:r>
+        <w:rPr>
+          <w:rFonts w:ascii="宋体" w:hAnsi="宋体" w:hint="eastAsia"/>
+          <w:szCs w:val="24"/>
+        </w:rPr>
+      </w:r>
+    </w:p>
+    <w:p>
+      <w:pPr>
+        <w:ind w:firstLineChars="200" w:firstLine="480"/>
+        <w:rPr>
+          <w:rFonts w:ascii="宋体" w:hAnsi="宋体" w:hint="eastAsia"/>
+          <w:szCs w:val="24"/>
+        </w:rPr>
+      </w:pPr>
+      <w:r>
+        <w:rPr>
+          <w:rFonts w:ascii="宋体" w:hAnsi="宋体" w:hint="eastAsia"/>
+          <w:szCs w:val="24"/>
+        </w:rPr>
+        <w:t>功能一：行程创建与管理。旅客输入一个或多个航班及出行信息，系统建立出行旅程并识别值机、安检、登机等关键时间节点，支持查看与更新行程。</w:t>
       </w:r>
       <w:r>
         <w:rPr>
           <w:rFonts w:cs="Times New Roman"/>
           <w:szCs w:val="24"/>
         </w:rPr>
-        <w:t>Agent</w:t>
-      </w:r>
-      <w:r>
-        <w:rPr>
-          <w:rFonts w:ascii="宋体" w:hAnsi="宋体" w:hint="eastAsia"/>
-          <w:szCs w:val="24"/>
-        </w:rPr>
-        <w:t xml:space="preserve"> 重新计算后续行程的影响，并更新旅客的整体出行计划。</w:t>
-      </w:r>
-    </w:p>
-    <w:p>
-      <w:pPr>
-        <w:ind w:firstLineChars="200" w:firstLine="480"/>
-        <w:rPr>
-          <w:rFonts w:ascii="宋体" w:hAnsi="宋体" w:hint="eastAsia"/>
-          <w:szCs w:val="24"/>
-        </w:rPr>
-      </w:pPr>
-      <w:r>
-        <w:rPr>
-          <w:rFonts w:ascii="宋体" w:hAnsi="宋体" w:hint="eastAsia"/>
-          <w:szCs w:val="24"/>
-        </w:rPr>
-        <w:t xml:space="preserve">功能二：航班状态、机场状态和旅客状态融合。云端 </w:t>
+      </w:r>
+      <w:r>
+        <w:rPr>
+          <w:rFonts w:ascii="宋体" w:hAnsi="宋体" w:hint="eastAsia"/>
+          <w:szCs w:val="24"/>
+        </w:rPr>
+      </w:r>
+    </w:p>
+    <w:p>
+      <w:pPr>
+        <w:ind w:firstLineChars="200" w:firstLine="480"/>
+        <w:rPr>
+          <w:rFonts w:ascii="宋体" w:hAnsi="宋体" w:hint="eastAsia"/>
+          <w:szCs w:val="24"/>
+        </w:rPr>
+      </w:pPr>
+      <w:r>
+        <w:rPr>
+          <w:rFonts w:ascii="宋体" w:hAnsi="宋体" w:hint="eastAsia"/>
+          <w:szCs w:val="24"/>
+        </w:rPr>
+        <w:t>功能二：行程状态获取。数据感知 Agent 通过数据技能与工具获取航班动态、机场运行、城市交通和旅客位置等信息，形成统一的当前行程状态。</w:t>
       </w:r>
       <w:r>
         <w:rPr>
           <w:rFonts w:cs="Times New Roman"/>
           <w:szCs w:val="24"/>
         </w:rPr>
-        <w:t>Agent</w:t>
-      </w:r>
-      <w:r>
-        <w:rPr>
-          <w:rFonts w:ascii="宋体" w:hAnsi="宋体" w:hint="eastAsia"/>
-          <w:szCs w:val="24"/>
-        </w:rPr>
-        <w:t xml:space="preserve"> 实时获取航班状态和机场状态，同时接收客户端上传的旅客当前位置和当前时间。系统综合判断旅客当前处于前往机场、到达机场、值机、安检、候机或前往登机口等阶段，并计算旅客距离下一个关键节点所需的时间。</w:t>
-      </w:r>
-    </w:p>
-    <w:p>
-      <w:pPr>
-        <w:ind w:firstLineChars="200" w:firstLine="480"/>
-        <w:rPr>
-          <w:rFonts w:ascii="宋体" w:hAnsi="宋体" w:hint="eastAsia"/>
-          <w:szCs w:val="24"/>
-        </w:rPr>
-      </w:pPr>
-      <w:r>
-        <w:rPr>
-          <w:rFonts w:ascii="宋体" w:hAnsi="宋体" w:hint="eastAsia"/>
-          <w:szCs w:val="24"/>
-        </w:rPr>
-        <w:t xml:space="preserve">功能三：动态保障方案与下一行动生成。云端 </w:t>
+      </w:r>
+      <w:r>
+        <w:rPr>
+          <w:rFonts w:ascii="宋体" w:hAnsi="宋体" w:hint="eastAsia"/>
+          <w:szCs w:val="24"/>
+        </w:rPr>
+      </w:r>
+    </w:p>
+    <w:p>
+      <w:pPr>
+        <w:ind w:firstLineChars="200" w:firstLine="480"/>
+        <w:rPr>
+          <w:rFonts w:ascii="宋体" w:hAnsi="宋体" w:hint="eastAsia"/>
+          <w:szCs w:val="24"/>
+        </w:rPr>
+      </w:pPr>
+      <w:r>
+        <w:rPr>
+          <w:rFonts w:ascii="宋体" w:hAnsi="宋体" w:hint="eastAsia"/>
+          <w:szCs w:val="24"/>
+        </w:rPr>
+        <w:t>功能三：旅客状态分析。行动决策 Agent 根据当前时间、航班状态、机场状态和旅客位置，分析旅客所处的出行阶段及可能面临的时间风险。</w:t>
       </w:r>
       <w:r>
         <w:rPr>
           <w:rFonts w:cs="Times New Roman"/>
           <w:szCs w:val="24"/>
         </w:rPr>
-        <w:t>Agent</w:t>
-      </w:r>
-      <w:r>
-        <w:rPr>
-          <w:rFonts w:ascii="宋体" w:hAnsi="宋体" w:hint="eastAsia"/>
-          <w:szCs w:val="24"/>
-        </w:rPr>
-        <w:t xml:space="preserve"> 根据航班时间、机场节点、旅客位置、步行时间和机场运行状态，判断旅客当前行程是否存在延误或错过航班的风险。当状态发生变化时，系统自动重新规划方案，并生成明确的下一步行动，例如前往机场、前往安检区域、直接前往登机口或前往航司服务柜台。系统只提供辅助建议，不自动执行改签、支付等操作。</w:t>
-      </w:r>
-    </w:p>
-    <w:p>
-      <w:pPr>
-        <w:ind w:firstLineChars="200" w:firstLine="480"/>
-        <w:rPr>
-          <w:rFonts w:ascii="宋体" w:hAnsi="宋体" w:hint="eastAsia"/>
-          <w:szCs w:val="24"/>
-        </w:rPr>
-      </w:pPr>
-      <w:r>
-        <w:rPr>
-          <w:rFonts w:ascii="宋体" w:hAnsi="宋体" w:hint="eastAsia"/>
-          <w:szCs w:val="24"/>
-        </w:rPr>
-        <w:t xml:space="preserve">功能四：基于 </w:t>
+      </w:r>
+      <w:r>
+        <w:rPr>
+          <w:rFonts w:ascii="宋体" w:hAnsi="宋体" w:hint="eastAsia"/>
+          <w:szCs w:val="24"/>
+        </w:rPr>
+      </w:r>
+    </w:p>
+    <w:p>
+      <w:pPr>
+        <w:ind w:firstLineChars="200" w:firstLine="480"/>
+        <w:rPr>
+          <w:rFonts w:ascii="宋体" w:hAnsi="宋体" w:hint="eastAsia"/>
+          <w:szCs w:val="24"/>
+        </w:rPr>
+      </w:pPr>
+      <w:r>
+        <w:rPr>
+          <w:rFonts w:ascii="宋体" w:hAnsi="宋体" w:hint="eastAsia"/>
+          <w:szCs w:val="24"/>
+        </w:rPr>
+        <w:t>功能四：行动建议生成。系统生成有优先级的下一步行动建议，如立即出发、办理值机或托运、前往安检或登机口、关注航班异常、联系航空公司等，并说明建议依据和风险等级。</w:t>
       </w:r>
       <w:r>
         <w:rPr>
           <w:rFonts w:cs="Times New Roman"/>
           <w:szCs w:val="24"/>
         </w:rPr>
-        <w:t>GUI</w:t>
-      </w:r>
-      <w:r>
-        <w:rPr>
-          <w:rFonts w:ascii="宋体" w:hAnsi="宋体" w:hint="eastAsia"/>
-          <w:szCs w:val="24"/>
-        </w:rPr>
-        <w:t xml:space="preserve"> 的旅客行动引导。客户端不以长篇文字作为主要输出，而是通过图形界面展示航班状态、当前位置、机场路线、剩余时间、登机口和下一行动。界面主要包括航班状态区域、地图路线区域、行程时间轴、倒计时和行动提示卡片。当云端 </w:t>
+      </w:r>
+      <w:r>
+        <w:rPr>
+          <w:rFonts w:ascii="宋体" w:hAnsi="宋体" w:hint="eastAsia"/>
+          <w:szCs w:val="24"/>
+        </w:rPr>
       </w:r>
       <w:r>
         <w:rPr>
           <w:rFonts w:cs="Times New Roman"/>
           <w:szCs w:val="24"/>
         </w:rPr>
-        <w:t>Agent</w:t>
-      </w:r>
-      <w:r>
-        <w:rPr>
-          <w:rFonts w:ascii="宋体" w:hAnsi="宋体" w:hint="eastAsia"/>
-          <w:szCs w:val="24"/>
-        </w:rPr>
-        <w:t xml:space="preserve"> 返回新的处理结果时，客户端自动刷新界面，使旅客能够直观看到当前状态和下一步操作。</w:t>
-      </w:r>
-    </w:p>
-    <w:p>
-      <w:pPr>
-        <w:ind w:firstLineChars="200" w:firstLine="480"/>
-        <w:rPr>
-          <w:rFonts w:ascii="宋体" w:hAnsi="宋体" w:hint="eastAsia"/>
-          <w:szCs w:val="24"/>
-        </w:rPr>
-      </w:pPr>
-      <w:r>
-        <w:rPr>
-          <w:rFonts w:ascii="宋体" w:hAnsi="宋体" w:hint="eastAsia"/>
-          <w:szCs w:val="24"/>
-        </w:rPr>
-        <w:t>功能五：建议解释与异常回退。系统为每条行动建议显示生成时间、数据更新时间、主要判断依据和风险等级，使旅客能够了解建议的来源。当航班接口、机场接口、定位服务或网络连接出现异常时，云端 Agent 使用最近一次有效数据继续生成基础提示；客户端则显示数据失效提示，并允许旅客手动确认当前位置或行程阶段。对于无法确认的情况，系统不生成确定性结论，而是提示旅客以航司、机场工作人员发布的信息为准。</w:t>
+      </w:r>
+      <w:r>
+        <w:rPr>
+          <w:rFonts w:ascii="宋体" w:hAnsi="宋体" w:hint="eastAsia"/>
+          <w:szCs w:val="24"/>
+        </w:rPr>
+      </w:r>
+    </w:p>
+    <w:p>
+      <w:pPr>
+        <w:ind w:firstLineChars="200" w:firstLine="480"/>
+        <w:rPr>
+          <w:rFonts w:ascii="宋体" w:hAnsi="宋体" w:hint="eastAsia"/>
+          <w:szCs w:val="24"/>
+        </w:rPr>
+      </w:pPr>
+      <w:r>
+        <w:rPr>
+          <w:rFonts w:ascii="宋体" w:hAnsi="宋体" w:hint="eastAsia"/>
+          <w:szCs w:val="24"/>
+        </w:rPr>
+        <w:t>功能五：行程状态展示与更新。前端以状态区、时间轴和行动卡片等方式展示分析结果，支持定时或实时更新；需要城市导航时可跳转地图导航应用，机场内提供各节点的文字步行指引。</w:t>
       </w:r>
     </w:p>
     <w:p>
@@ -2136,35 +2108,31 @@
           <w:rFonts w:ascii="宋体" w:hAnsi="宋体" w:hint="eastAsia"/>
           <w:szCs w:val="24"/>
         </w:rPr>
-        <w:t>从技术上看，本系统具有较强的可行性。客户端只负责航班输入、定位获取、数据上传和</w:t>
+        <w:t>从技术上看，本系统具有较强的可行性。客户端只负责航班输入、定位获取、数据上传和 GUI 展示，云端 Agent 负责数据获取、状态融合、风险判断和行动建议生成。数据感知 Agent 与行动决策 Agent 均通过调用大模型完成状态理解与行动决策，不需要训练民航专用模型；系统通过提示词、数据技能与工具约束 Agent 的输出，航班、机场、路线和旅客位置等状态数据由数据技能与工具实时获取，避免模型依赖记忆编造数据。</w:t>
       </w:r>
       <w:r>
         <w:rPr>
           <w:rFonts w:cs="Times New Roman"/>
           <w:szCs w:val="24"/>
         </w:rPr>
-        <w:t xml:space="preserve"> GUI</w:t>
-      </w:r>
-      <w:r>
-        <w:rPr>
-          <w:rFonts w:ascii="宋体" w:hAnsi="宋体" w:hint="eastAsia"/>
-          <w:szCs w:val="24"/>
-        </w:rPr>
-        <w:t xml:space="preserve"> 展示，云端 </w:t>
+      </w:r>
+      <w:r>
+        <w:rPr>
+          <w:rFonts w:ascii="宋体" w:hAnsi="宋体" w:hint="eastAsia"/>
+          <w:szCs w:val="24"/>
+        </w:rPr>
       </w:r>
       <w:r>
         <w:rPr>
           <w:rFonts w:cs="Times New Roman"/>
           <w:szCs w:val="24"/>
         </w:rPr>
-        <w:t>Agent</w:t>
-      </w:r>
-      <w:r>
-        <w:rPr>
-          <w:rFonts w:ascii="宋体" w:hAnsi="宋体" w:hint="eastAsia"/>
-          <w:szCs w:val="24"/>
-        </w:rPr>
-        <w:t xml:space="preserve"> 负责数据获取、状态融合、风险判断和行动建议生成。系统不需要训练复杂的民航大模型，可以先使用规则判断、时间计算和路径估算实现核心功能，再根据需要增加预测模型或大模型解释能力。</w:t>
+      </w:r>
+      <w:r>
+        <w:rPr>
+          <w:rFonts w:ascii="宋体" w:hAnsi="宋体" w:hint="eastAsia"/>
+          <w:szCs w:val="24"/>
+        </w:rPr>
       </w:r>
     </w:p>
     <w:p>
@@ -2181,7 +2149,7 @@
           <w:rFonts w:ascii="宋体" w:hAnsi="宋体" w:hint="eastAsia"/>
           <w:szCs w:val="24"/>
         </w:rPr>
-        <w:t>系统所需的数据来源主要包括以下几类：第一类是航班动态数据，可在具备开放接口的情况下接入航空公司或机场提供的航班信息；在课程设计阶段，可以使用本地 JSON 数据、模拟航班数据和预先设计的延误、取消、登机口变更等事件进行演示。第二类是机场信息，包括航站楼、值机柜台、安检区域、登机口、机场内部路线和节点距离等，可使用机场公开地图资料整理形成静态数据。第三类是旅客位置和时间数据，由客户端在获得用户授权后获取。第四类是机场状态数据，例如安检排队时间、通道开放状态和登机口变更信息；如果暂时无法获得真实接口，可以使用服务端模拟数据，并在界面中标明数据更新时间和数据来源。</w:t>
+        <w:t>系统所需的数据来源主要包括以下几类：第一类是航班动态数据，接入航空公司或机场提供的航班信息，由数据感知 Agent 通过统一的数据技能与工具获取，并记录来源与更新时间。第二类是机场信息，包括航站楼、值机柜台、安检区域、登机口、机场内部路线和节点距离等，来自机场公开资料整理的节点与路径数据。第三类是旅客位置和时间数据，由客户端在获得用户授权后获取。第四类是机场状态数据，例如安检排队时间、通道开放状态和登机口变更信息；无法获取时使用最近一次有效数据降级，并在界面中标明数据更新时间和数据来源。</w:t>
       </w:r>
     </w:p>
     <w:p>
@@ -2198,7 +2166,7 @@
           <w:rFonts w:ascii="宋体" w:hAnsi="宋体" w:hint="eastAsia"/>
           <w:szCs w:val="24"/>
         </w:rPr>
-        <w:t>在软硬件条件方面，客户端可以运行在普通电脑或移动设备上，利用系统自带的定位和网络功能获取旅客状态。云端服务端只需要提供数据接口、Agent 处理服务、状态存储和消息返回功能，不依赖特殊硬件。课程项目可以先采用单机场、单航班和模拟数据完成原型，再逐步扩展到多机场和多航班场景。</w:t>
+        <w:t>在软硬件条件方面，客户端可以运行在普通电脑或移动设备上，利用系统自带的定位和网络功能获取旅客状态。云端服务端只需要提供数据接口、Agent 处理服务、状态存储和消息返回功能，不依赖特殊硬件。课程项目可以先采用单机场、单航班完成原型，再逐步扩展到多机场和多航班场景。</w:t>
       </w:r>
     </w:p>
     <w:p>
@@ -2246,7 +2214,7 @@
           <w:rFonts w:ascii="宋体" w:hAnsi="宋体" w:hint="eastAsia"/>
           <w:szCs w:val="24"/>
         </w:rPr>
-        <w:t>潜在风险一：航班或机场数据接口无法获取、数据延迟或数据中断。解决方案是设计统一的数据适配接口，同时保留模拟数据和离线事件回放功能。当外部接口不可用时，系统使用最近一次有效数据或模拟数据继续演示，并明确显示数据更新时间，不能将模拟数据伪装成真实实时数据。</w:t>
+        <w:t>潜在风险一：航班或机场数据接口无法获取、数据延迟或数据中断。解决方案是设计统一的数据技能与工具接口，为每条数据记录来源、时间戳和有效期。当外部接口不可用时，系统使用最近一次有效数据继续生成基础提示，并明确显示数据更新时间和降级状态，不把过期数据当作实时数据使用。</w:t>
       </w:r>
     </w:p>
     <w:p>
@@ -2311,35 +2279,31 @@
           <w:rFonts w:ascii="宋体" w:hAnsi="宋体" w:hint="eastAsia"/>
           <w:szCs w:val="24"/>
         </w:rPr>
-        <w:t>潜在风险四：</w:t>
+        <w:t>潜在风险四：Agent 生成的行动建议不准确。解决方案是通过提示词、数据技能与工具约束 Agent 的输出，将值机截止、登机截止等关键时间和机场节点顺序设置为不可违反的硬约束；建议同时显示判断依据、数据更新时间和风险等级。系统只提供辅助建议，不自动执行改签、支付或其他高影响操作。</w:t>
       </w:r>
       <w:r>
         <w:rPr>
           <w:rFonts w:cs="Times New Roman"/>
           <w:szCs w:val="24"/>
         </w:rPr>
-        <w:t>Agent</w:t>
-      </w:r>
-      <w:r>
-        <w:rPr>
-          <w:rFonts w:ascii="宋体" w:hAnsi="宋体" w:hint="eastAsia"/>
-          <w:szCs w:val="24"/>
-        </w:rPr>
-        <w:t xml:space="preserve"> 生成的行动建议不准确。解决方案是将登机截止时间、剩余时间和机场节点顺序设置为硬性规则，</w:t>
+      </w:r>
+      <w:r>
+        <w:rPr>
+          <w:rFonts w:ascii="宋体" w:hAnsi="宋体" w:hint="eastAsia"/>
+          <w:szCs w:val="24"/>
+        </w:rPr>
       </w:r>
       <w:r>
         <w:rPr>
           <w:rFonts w:cs="Times New Roman"/>
           <w:szCs w:val="24"/>
         </w:rPr>
-        <w:t>Agent</w:t>
-      </w:r>
-      <w:r>
-        <w:rPr>
-          <w:rFonts w:ascii="宋体" w:hAnsi="宋体" w:hint="eastAsia"/>
-          <w:szCs w:val="24"/>
-        </w:rPr>
-        <w:t xml:space="preserve"> 不能违反这些基本约束；预测结果同时显示判断依据、数据更新时间和风险等级。系统只提供辅助建议，不自动执行改签、支付或其他高影响操作。</w:t>
+      </w:r>
+      <w:r>
+        <w:rPr>
+          <w:rFonts w:ascii="宋体" w:hAnsi="宋体" w:hint="eastAsia"/>
+          <w:szCs w:val="24"/>
+        </w:rPr>
       </w:r>
     </w:p>
     <w:p>
@@ -2414,16 +2378,6 @@
         </w:rPr>
         <w:t xml:space="preserve"> 展示”确定为最小可行版本，其他功能暂不纳入第一阶段。系统完成基本闭环后，再考虑多航班、多机场和真实数据接口扩展。</w:t>
       </w:r>
-    </w:p>
-    <w:p>
-      <w:pPr>
-        <w:ind w:firstLine="420"/>
-        <w:jc w:val="left"/>
-        <w:rPr>
-          <w:rFonts w:ascii="楷体" w:eastAsia="楷体" w:hAnsi="楷体" w:cs="楷体" w:hint="eastAsia"/>
-          <w:szCs w:val="21"/>
-        </w:rPr>
-      </w:pPr>
     </w:p>
     <w:sectPr>
       <w:pgSz w:w="11906" w:h="16838"/>

</xml_diff>